<commit_message>
fix(docs): Update group member names in project documentation
</commit_message>
<xml_diff>
--- a/Inventory-Management-System-for-a-Small-Store-updated.docx
+++ b/Inventory-Management-System-for-a-Small-Store-updated.docx
@@ -245,6 +245,24 @@
           <w:b/>
           <w:bCs/>
         </w:rPr>
+        <w:t>EDUARTE, GABRIEL ISAAC</w:t>
+      </w:r>
+    </w:p>
+    <w:p>
+      <w:pPr>
+        <w:jc w:val="center"/>
+        <w:rPr>
+          <w:rFonts w:ascii="Arial" w:eastAsia="Arial" w:hAnsi="Arial" w:cs="Arial"/>
+          <w:b/>
+          <w:bCs/>
+        </w:rPr>
+      </w:pPr>
+      <w:r>
+        <w:rPr>
+          <w:rFonts w:ascii="Arial" w:eastAsia="Arial" w:hAnsi="Arial" w:cs="Arial"/>
+          <w:b/>
+          <w:bCs/>
+        </w:rPr>
         <w:t>FELICIANO, DARLENE</w:t>
       </w:r>
     </w:p>
@@ -324,7 +342,23 @@
           <w:b/>
           <w:bCs/>
         </w:rPr>
-        <w:t>OLDAN, LARVIE</w:t>
+        <w:t xml:space="preserve">OLDAN, </w:t>
+      </w:r>
+      <w:r>
+        <w:rPr>
+          <w:rFonts w:ascii="Arial" w:eastAsia="Arial" w:hAnsi="Arial" w:cs="Arial"/>
+          <w:b/>
+          <w:bCs/>
+        </w:rPr>
+        <w:t xml:space="preserve">JOHN </w:t>
+      </w:r>
+      <w:r>
+        <w:rPr>
+          <w:rFonts w:ascii="Arial" w:eastAsia="Arial" w:hAnsi="Arial" w:cs="Arial"/>
+          <w:b/>
+          <w:bCs/>
+        </w:rPr>
+        <w:t>LARVIE</w:t>
       </w:r>
     </w:p>
     <w:p>
@@ -382,7 +416,6 @@
           <w:b/>
           <w:bCs/>
         </w:rPr>
-        <w:lastRenderedPageBreak/>
         <w:t>BACKGROUND OF THE STUDY</w:t>
       </w:r>
     </w:p>
@@ -4048,6 +4081,7 @@
   <w:style w:type="character" w:default="1" w:styleId="DefaultParagraphFont">
     <w:name w:val="Default Paragraph Font"/>
     <w:uiPriority w:val="1"/>
+    <w:semiHidden/>
     <w:unhideWhenUsed/>
   </w:style>
   <w:style w:type="table" w:default="1" w:styleId="TableNormal">

</xml_diff>